<commit_message>
Embed high-resolution schematic diagrams for all 12 physics experiments
</commit_message>
<xml_diff>
--- a/Almorshed_Physics_Complete_Baccalaureate_Guide.docx
+++ b/Almorshed_Physics_Complete_Baccalaureate_Guide.docx
@@ -356,6 +356,47 @@
           </w:p>
           <w:p>
             <w:pPr>
+              <w:spacing w:before="80" w:after="120"/>
+              <w:jc w:val="center"/>
+              <w:bidi w:val="0"/>
+            </w:pPr>
+            <w:r>
+              <w:drawing>
+                <wp:inline xmlns:a="http://schemas.openxmlformats.org/drawingml/2006/main" xmlns:pic="http://schemas.openxmlformats.org/drawingml/2006/picture">
+                  <wp:extent cx="4572000" cy="2560320"/>
+                  <wp:docPr id="1" name="Picture 1"/>
+                  <wp:cNvGraphicFramePr>
+                    <a:graphicFrameLocks noChangeAspect="1"/>
+                  </wp:cNvGraphicFramePr>
+                  <a:graphic>
+                    <a:graphicData uri="http://schemas.openxmlformats.org/drawingml/2006/picture">
+                      <pic:pic>
+                        <pic:nvPicPr>
+                          <pic:cNvPr id="0" name="exp1_spring_pendulum.png"/>
+                          <pic:cNvPicPr/>
+                        </pic:nvPicPr>
+                        <pic:blipFill>
+                          <a:blip r:embed="rId9"/>
+                          <a:stretch>
+                            <a:fillRect/>
+                          </a:stretch>
+                        </pic:blipFill>
+                        <pic:spPr>
+                          <a:xfrm>
+                            <a:off x="0" y="0"/>
+                            <a:ext cx="4572000" cy="2560320"/>
+                          </a:xfrm>
+                          <a:prstGeom prst="rect"/>
+                        </pic:spPr>
+                      </pic:pic>
+                    </a:graphicData>
+                  </a:graphic>
+                </wp:inline>
+              </w:drawing>
+            </w:r>
+          </w:p>
+          <w:p>
+            <w:pPr>
               <w:spacing w:after="40" w:line="276" w:lineRule="auto"/>
               <w:jc w:val="right"/>
               <w:bidi/>
@@ -2141,6 +2182,47 @@
                 <w:sz w:val="23"/>
               </w:rPr>
               <w:t>❖ تجربة مخبرية: تحقيق علاقة الدور الخاص لنواس الفتل وتأثير توزيع الكتلة</w:t>
+            </w:r>
+          </w:p>
+          <w:p>
+            <w:pPr>
+              <w:spacing w:before="80" w:after="120"/>
+              <w:jc w:val="center"/>
+              <w:bidi w:val="0"/>
+            </w:pPr>
+            <w:r>
+              <w:drawing>
+                <wp:inline xmlns:a="http://schemas.openxmlformats.org/drawingml/2006/main" xmlns:pic="http://schemas.openxmlformats.org/drawingml/2006/picture">
+                  <wp:extent cx="4572000" cy="2560320"/>
+                  <wp:docPr id="2" name="Picture 2"/>
+                  <wp:cNvGraphicFramePr>
+                    <a:graphicFrameLocks noChangeAspect="1"/>
+                  </wp:cNvGraphicFramePr>
+                  <a:graphic>
+                    <a:graphicData uri="http://schemas.openxmlformats.org/drawingml/2006/picture">
+                      <pic:pic>
+                        <pic:nvPicPr>
+                          <pic:cNvPr id="0" name="exp2_torsion_pendulum.png"/>
+                          <pic:cNvPicPr/>
+                        </pic:nvPicPr>
+                        <pic:blipFill>
+                          <a:blip r:embed="rId10"/>
+                          <a:stretch>
+                            <a:fillRect/>
+                          </a:stretch>
+                        </pic:blipFill>
+                        <pic:spPr>
+                          <a:xfrm>
+                            <a:off x="0" y="0"/>
+                            <a:ext cx="4572000" cy="2560320"/>
+                          </a:xfrm>
+                          <a:prstGeom prst="rect"/>
+                        </pic:spPr>
+                      </pic:pic>
+                    </a:graphicData>
+                  </a:graphic>
+                </wp:inline>
+              </w:drawing>
             </w:r>
           </w:p>
           <w:p>
@@ -5441,6 +5523,47 @@
           </w:p>
           <w:p>
             <w:pPr>
+              <w:spacing w:before="80" w:after="120"/>
+              <w:jc w:val="center"/>
+              <w:bidi w:val="0"/>
+            </w:pPr>
+            <w:r>
+              <w:drawing>
+                <wp:inline xmlns:a="http://schemas.openxmlformats.org/drawingml/2006/main" xmlns:pic="http://schemas.openxmlformats.org/drawingml/2006/picture">
+                  <wp:extent cx="4572000" cy="2560320"/>
+                  <wp:docPr id="3" name="Picture 3"/>
+                  <wp:cNvGraphicFramePr>
+                    <a:graphicFrameLocks noChangeAspect="1"/>
+                  </wp:cNvGraphicFramePr>
+                  <a:graphic>
+                    <a:graphicData uri="http://schemas.openxmlformats.org/drawingml/2006/picture">
+                      <pic:pic>
+                        <pic:nvPicPr>
+                          <pic:cNvPr id="0" name="exp3_venturi_tube.png"/>
+                          <pic:cNvPicPr/>
+                        </pic:nvPicPr>
+                        <pic:blipFill>
+                          <a:blip r:embed="rId11"/>
+                          <a:stretch>
+                            <a:fillRect/>
+                          </a:stretch>
+                        </pic:blipFill>
+                        <pic:spPr>
+                          <a:xfrm>
+                            <a:off x="0" y="0"/>
+                            <a:ext cx="4572000" cy="2560320"/>
+                          </a:xfrm>
+                          <a:prstGeom prst="rect"/>
+                        </pic:spPr>
+                      </pic:pic>
+                    </a:graphicData>
+                  </a:graphic>
+                </wp:inline>
+              </w:drawing>
+            </w:r>
+          </w:p>
+          <w:p>
+            <w:pPr>
               <w:spacing w:after="40" w:line="276" w:lineRule="auto"/>
               <w:jc w:val="right"/>
               <w:bidi/>
@@ -8122,6 +8245,47 @@
           </w:p>
           <w:p>
             <w:pPr>
+              <w:spacing w:before="80" w:after="120"/>
+              <w:jc w:val="center"/>
+              <w:bidi w:val="0"/>
+            </w:pPr>
+            <w:r>
+              <w:drawing>
+                <wp:inline xmlns:a="http://schemas.openxmlformats.org/drawingml/2006/main" xmlns:pic="http://schemas.openxmlformats.org/drawingml/2006/picture">
+                  <wp:extent cx="4572000" cy="2560320"/>
+                  <wp:docPr id="4" name="Picture 4"/>
+                  <wp:cNvGraphicFramePr>
+                    <a:graphicFrameLocks noChangeAspect="1"/>
+                  </wp:cNvGraphicFramePr>
+                  <a:graphic>
+                    <a:graphicData uri="http://schemas.openxmlformats.org/drawingml/2006/picture">
+                      <pic:pic>
+                        <pic:nvPicPr>
+                          <pic:cNvPr id="0" name="exp4_laplace_rails.png"/>
+                          <pic:cNvPicPr/>
+                        </pic:nvPicPr>
+                        <pic:blipFill>
+                          <a:blip r:embed="rId12"/>
+                          <a:stretch>
+                            <a:fillRect/>
+                          </a:stretch>
+                        </pic:blipFill>
+                        <pic:spPr>
+                          <a:xfrm>
+                            <a:off x="0" y="0"/>
+                            <a:ext cx="4572000" cy="2560320"/>
+                          </a:xfrm>
+                          <a:prstGeom prst="rect"/>
+                        </pic:spPr>
+                      </pic:pic>
+                    </a:graphicData>
+                  </a:graphic>
+                </wp:inline>
+              </w:drawing>
+            </w:r>
+          </w:p>
+          <w:p>
+            <w:pPr>
               <w:spacing w:after="40" w:line="276" w:lineRule="auto"/>
               <w:jc w:val="right"/>
               <w:bidi/>
@@ -8902,6 +9066,47 @@
           </w:p>
           <w:p>
             <w:pPr>
+              <w:spacing w:before="80" w:after="120"/>
+              <w:jc w:val="center"/>
+              <w:bidi w:val="0"/>
+            </w:pPr>
+            <w:r>
+              <w:drawing>
+                <wp:inline xmlns:a="http://schemas.openxmlformats.org/drawingml/2006/main" xmlns:pic="http://schemas.openxmlformats.org/drawingml/2006/picture">
+                  <wp:extent cx="4572000" cy="2560320"/>
+                  <wp:docPr id="5" name="Picture 5"/>
+                  <wp:cNvGraphicFramePr>
+                    <a:graphicFrameLocks noChangeAspect="1"/>
+                  </wp:cNvGraphicFramePr>
+                  <a:graphic>
+                    <a:graphicData uri="http://schemas.openxmlformats.org/drawingml/2006/picture">
+                      <pic:pic>
+                        <pic:nvPicPr>
+                          <pic:cNvPr id="0" name="exp5_faraday_induction.png"/>
+                          <pic:cNvPicPr/>
+                        </pic:nvPicPr>
+                        <pic:blipFill>
+                          <a:blip r:embed="rId13"/>
+                          <a:stretch>
+                            <a:fillRect/>
+                          </a:stretch>
+                        </pic:blipFill>
+                        <pic:spPr>
+                          <a:xfrm>
+                            <a:off x="0" y="0"/>
+                            <a:ext cx="4572000" cy="2560320"/>
+                          </a:xfrm>
+                          <a:prstGeom prst="rect"/>
+                        </pic:spPr>
+                      </pic:pic>
+                    </a:graphicData>
+                  </a:graphic>
+                </wp:inline>
+              </w:drawing>
+            </w:r>
+          </w:p>
+          <w:p>
+            <w:pPr>
               <w:spacing w:after="40" w:line="276" w:lineRule="auto"/>
               <w:jc w:val="right"/>
               <w:bidi/>
@@ -9168,6 +9373,47 @@
                 <w:sz w:val="23"/>
               </w:rPr>
               <w:t>❖ تجارب التحريض الذاتي: ظاهرة وصل وقطع التيار</w:t>
+            </w:r>
+          </w:p>
+          <w:p>
+            <w:pPr>
+              <w:spacing w:before="80" w:after="120"/>
+              <w:jc w:val="center"/>
+              <w:bidi w:val="0"/>
+            </w:pPr>
+            <w:r>
+              <w:drawing>
+                <wp:inline xmlns:a="http://schemas.openxmlformats.org/drawingml/2006/main" xmlns:pic="http://schemas.openxmlformats.org/drawingml/2006/picture">
+                  <wp:extent cx="4572000" cy="2560320"/>
+                  <wp:docPr id="6" name="Picture 6"/>
+                  <wp:cNvGraphicFramePr>
+                    <a:graphicFrameLocks noChangeAspect="1"/>
+                  </wp:cNvGraphicFramePr>
+                  <a:graphic>
+                    <a:graphicData uri="http://schemas.openxmlformats.org/drawingml/2006/picture">
+                      <pic:pic>
+                        <pic:nvPicPr>
+                          <pic:cNvPr id="0" name="exp6_self_induction.png"/>
+                          <pic:cNvPicPr/>
+                        </pic:nvPicPr>
+                        <pic:blipFill>
+                          <a:blip r:embed="rId14"/>
+                          <a:stretch>
+                            <a:fillRect/>
+                          </a:stretch>
+                        </pic:blipFill>
+                        <pic:spPr>
+                          <a:xfrm>
+                            <a:off x="0" y="0"/>
+                            <a:ext cx="4572000" cy="2560320"/>
+                          </a:xfrm>
+                          <a:prstGeom prst="rect"/>
+                        </pic:spPr>
+                      </pic:pic>
+                    </a:graphicData>
+                  </a:graphic>
+                </wp:inline>
+              </w:drawing>
             </w:r>
           </w:p>
           <w:p>
@@ -11620,6 +11866,47 @@
           </w:p>
           <w:p>
             <w:pPr>
+              <w:spacing w:before="80" w:after="120"/>
+              <w:jc w:val="center"/>
+              <w:bidi w:val="0"/>
+            </w:pPr>
+            <w:r>
+              <w:drawing>
+                <wp:inline xmlns:a="http://schemas.openxmlformats.org/drawingml/2006/main" xmlns:pic="http://schemas.openxmlformats.org/drawingml/2006/picture">
+                  <wp:extent cx="4572000" cy="2560320"/>
+                  <wp:docPr id="7" name="Picture 7"/>
+                  <wp:cNvGraphicFramePr>
+                    <a:graphicFrameLocks noChangeAspect="1"/>
+                  </wp:cNvGraphicFramePr>
+                  <a:graphic>
+                    <a:graphicData uri="http://schemas.openxmlformats.org/drawingml/2006/picture">
+                      <pic:pic>
+                        <pic:nvPicPr>
+                          <pic:cNvPr id="0" name="exp7_lc_oscillations.png"/>
+                          <pic:cNvPicPr/>
+                        </pic:nvPicPr>
+                        <pic:blipFill>
+                          <a:blip r:embed="rId15"/>
+                          <a:stretch>
+                            <a:fillRect/>
+                          </a:stretch>
+                        </pic:blipFill>
+                        <pic:spPr>
+                          <a:xfrm>
+                            <a:off x="0" y="0"/>
+                            <a:ext cx="4572000" cy="2560320"/>
+                          </a:xfrm>
+                          <a:prstGeom prst="rect"/>
+                        </pic:spPr>
+                      </pic:pic>
+                    </a:graphicData>
+                  </a:graphic>
+                </wp:inline>
+              </w:drawing>
+            </w:r>
+          </w:p>
+          <w:p>
+            <w:pPr>
               <w:spacing w:after="40" w:line="276" w:lineRule="auto"/>
               <w:jc w:val="right"/>
               <w:bidi/>
@@ -15027,6 +15314,47 @@
           </w:p>
           <w:p>
             <w:pPr>
+              <w:spacing w:before="80" w:after="120"/>
+              <w:jc w:val="center"/>
+              <w:bidi w:val="0"/>
+            </w:pPr>
+            <w:r>
+              <w:drawing>
+                <wp:inline xmlns:a="http://schemas.openxmlformats.org/drawingml/2006/main" xmlns:pic="http://schemas.openxmlformats.org/drawingml/2006/picture">
+                  <wp:extent cx="4572000" cy="2560320"/>
+                  <wp:docPr id="8" name="Picture 8"/>
+                  <wp:cNvGraphicFramePr>
+                    <a:graphicFrameLocks noChangeAspect="1"/>
+                  </wp:cNvGraphicFramePr>
+                  <a:graphic>
+                    <a:graphicData uri="http://schemas.openxmlformats.org/drawingml/2006/picture">
+                      <pic:pic>
+                        <pic:nvPicPr>
+                          <pic:cNvPr id="0" name="exp8_melde_waves.png"/>
+                          <pic:cNvPicPr/>
+                        </pic:nvPicPr>
+                        <pic:blipFill>
+                          <a:blip r:embed="rId16"/>
+                          <a:stretch>
+                            <a:fillRect/>
+                          </a:stretch>
+                        </pic:blipFill>
+                        <pic:spPr>
+                          <a:xfrm>
+                            <a:off x="0" y="0"/>
+                            <a:ext cx="4572000" cy="2560320"/>
+                          </a:xfrm>
+                          <a:prstGeom prst="rect"/>
+                        </pic:spPr>
+                      </pic:pic>
+                    </a:graphicData>
+                  </a:graphic>
+                </wp:inline>
+              </w:drawing>
+            </w:r>
+          </w:p>
+          <w:p>
+            <w:pPr>
               <w:spacing w:after="40" w:line="276" w:lineRule="auto"/>
               <w:jc w:val="right"/>
               <w:bidi/>
@@ -15871,6 +16199,47 @@
                 <w:sz w:val="23"/>
               </w:rPr>
               <w:t>❖ تجربة مخبرية: أنبوب كوندت (Kundt's Tube) لرنين الأعمدة الهوائية</w:t>
+            </w:r>
+          </w:p>
+          <w:p>
+            <w:pPr>
+              <w:spacing w:before="80" w:after="120"/>
+              <w:jc w:val="center"/>
+              <w:bidi w:val="0"/>
+            </w:pPr>
+            <w:r>
+              <w:drawing>
+                <wp:inline xmlns:a="http://schemas.openxmlformats.org/drawingml/2006/main" xmlns:pic="http://schemas.openxmlformats.org/drawingml/2006/picture">
+                  <wp:extent cx="4572000" cy="2560320"/>
+                  <wp:docPr id="9" name="Picture 9"/>
+                  <wp:cNvGraphicFramePr>
+                    <a:graphicFrameLocks noChangeAspect="1"/>
+                  </wp:cNvGraphicFramePr>
+                  <a:graphic>
+                    <a:graphicData uri="http://schemas.openxmlformats.org/drawingml/2006/picture">
+                      <pic:pic>
+                        <pic:nvPicPr>
+                          <pic:cNvPr id="0" name="exp9_kundt_tube.png"/>
+                          <pic:cNvPicPr/>
+                        </pic:nvPicPr>
+                        <pic:blipFill>
+                          <a:blip r:embed="rId17"/>
+                          <a:stretch>
+                            <a:fillRect/>
+                          </a:stretch>
+                        </pic:blipFill>
+                        <pic:spPr>
+                          <a:xfrm>
+                            <a:off x="0" y="0"/>
+                            <a:ext cx="4572000" cy="2560320"/>
+                          </a:xfrm>
+                          <a:prstGeom prst="rect"/>
+                        </pic:spPr>
+                      </pic:pic>
+                    </a:graphicData>
+                  </a:graphic>
+                </wp:inline>
+              </w:drawing>
             </w:r>
           </w:p>
           <w:p>
@@ -18358,6 +18727,47 @@
           </w:p>
           <w:p>
             <w:pPr>
+              <w:spacing w:before="80" w:after="120"/>
+              <w:jc w:val="center"/>
+              <w:bidi w:val="0"/>
+            </w:pPr>
+            <w:r>
+              <w:drawing>
+                <wp:inline xmlns:a="http://schemas.openxmlformats.org/drawingml/2006/main" xmlns:pic="http://schemas.openxmlformats.org/drawingml/2006/picture">
+                  <wp:extent cx="4572000" cy="2560320"/>
+                  <wp:docPr id="10" name="Picture 10"/>
+                  <wp:cNvGraphicFramePr>
+                    <a:graphicFrameLocks noChangeAspect="1"/>
+                  </wp:cNvGraphicFramePr>
+                  <a:graphic>
+                    <a:graphicData uri="http://schemas.openxmlformats.org/drawingml/2006/picture">
+                      <pic:pic>
+                        <pic:nvPicPr>
+                          <pic:cNvPr id="0" name="exp10_photoelectric.png"/>
+                          <pic:cNvPicPr/>
+                        </pic:nvPicPr>
+                        <pic:blipFill>
+                          <a:blip r:embed="rId18"/>
+                          <a:stretch>
+                            <a:fillRect/>
+                          </a:stretch>
+                        </pic:blipFill>
+                        <pic:spPr>
+                          <a:xfrm>
+                            <a:off x="0" y="0"/>
+                            <a:ext cx="4572000" cy="2560320"/>
+                          </a:xfrm>
+                          <a:prstGeom prst="rect"/>
+                        </pic:spPr>
+                      </pic:pic>
+                    </a:graphicData>
+                  </a:graphic>
+                </wp:inline>
+              </w:drawing>
+            </w:r>
+          </w:p>
+          <w:p>
+            <w:pPr>
               <w:spacing w:after="40" w:line="276" w:lineRule="auto"/>
               <w:jc w:val="right"/>
               <w:bidi/>
@@ -18594,6 +19004,47 @@
                 <w:sz w:val="23"/>
               </w:rPr>
               <w:t>❖ تجربة مخبرية: توليد الأشعة السينية في أنبوب كوليدج (Coolidge Tube)</w:t>
+            </w:r>
+          </w:p>
+          <w:p>
+            <w:pPr>
+              <w:spacing w:before="80" w:after="120"/>
+              <w:jc w:val="center"/>
+              <w:bidi w:val="0"/>
+            </w:pPr>
+            <w:r>
+              <w:drawing>
+                <wp:inline xmlns:a="http://schemas.openxmlformats.org/drawingml/2006/main" xmlns:pic="http://schemas.openxmlformats.org/drawingml/2006/picture">
+                  <wp:extent cx="4572000" cy="2560320"/>
+                  <wp:docPr id="11" name="Picture 11"/>
+                  <wp:cNvGraphicFramePr>
+                    <a:graphicFrameLocks noChangeAspect="1"/>
+                  </wp:cNvGraphicFramePr>
+                  <a:graphic>
+                    <a:graphicData uri="http://schemas.openxmlformats.org/drawingml/2006/picture">
+                      <pic:pic>
+                        <pic:nvPicPr>
+                          <pic:cNvPr id="0" name="exp11_coolidge_xray.png"/>
+                          <pic:cNvPicPr/>
+                        </pic:nvPicPr>
+                        <pic:blipFill>
+                          <a:blip r:embed="rId19"/>
+                          <a:stretch>
+                            <a:fillRect/>
+                          </a:stretch>
+                        </pic:blipFill>
+                        <pic:spPr>
+                          <a:xfrm>
+                            <a:off x="0" y="0"/>
+                            <a:ext cx="4572000" cy="2560320"/>
+                          </a:xfrm>
+                          <a:prstGeom prst="rect"/>
+                        </pic:spPr>
+                      </pic:pic>
+                    </a:graphicData>
+                  </a:graphic>
+                </wp:inline>
+              </w:drawing>
             </w:r>
           </w:p>
           <w:p>
@@ -20306,6 +20757,47 @@
                 <w:sz w:val="23"/>
               </w:rPr>
               <w:t>❖ تجربة مخبرية: تجربة مايكلسون ومورلي (Michelson-Morley Experiment)</w:t>
+            </w:r>
+          </w:p>
+          <w:p>
+            <w:pPr>
+              <w:spacing w:before="80" w:after="120"/>
+              <w:jc w:val="center"/>
+              <w:bidi w:val="0"/>
+            </w:pPr>
+            <w:r>
+              <w:drawing>
+                <wp:inline xmlns:a="http://schemas.openxmlformats.org/drawingml/2006/main" xmlns:pic="http://schemas.openxmlformats.org/drawingml/2006/picture">
+                  <wp:extent cx="4572000" cy="2560320"/>
+                  <wp:docPr id="12" name="Picture 12"/>
+                  <wp:cNvGraphicFramePr>
+                    <a:graphicFrameLocks noChangeAspect="1"/>
+                  </wp:cNvGraphicFramePr>
+                  <a:graphic>
+                    <a:graphicData uri="http://schemas.openxmlformats.org/drawingml/2006/picture">
+                      <pic:pic>
+                        <pic:nvPicPr>
+                          <pic:cNvPr id="0" name="exp12_michelson_morley.png"/>
+                          <pic:cNvPicPr/>
+                        </pic:nvPicPr>
+                        <pic:blipFill>
+                          <a:blip r:embed="rId20"/>
+                          <a:stretch>
+                            <a:fillRect/>
+                          </a:stretch>
+                        </pic:blipFill>
+                        <pic:spPr>
+                          <a:xfrm>
+                            <a:off x="0" y="0"/>
+                            <a:ext cx="4572000" cy="2560320"/>
+                          </a:xfrm>
+                          <a:prstGeom prst="rect"/>
+                        </pic:spPr>
+                      </pic:pic>
+                    </a:graphicData>
+                  </a:graphic>
+                </wp:inline>
+              </w:drawing>
             </w:r>
           </w:p>
           <w:p>

</xml_diff>